<commit_message>
Update review prompt with entity chain from structure chart
Co-Authored-By: Claude Fable 5.1 <noreply@anthropic.com>
Claude-Session: https://claude.ai/code/session_017WXGuxbkZxKJPwstVR3guK
</commit_message>
<xml_diff>
--- a/MJM_Secondary_Term_Sheet_Review_Prompt.docx
+++ b/MJM_Secondary_Term_Sheet_Review_Prompt.docx
@@ -63,7 +63,40 @@
         <w:pStyle w:val="FirstParagraph"/>
       </w:pPr>
       <w:r>
-        <w:t xml:space="preserve">For every entity named in the term sheet, confirm against the structure chart that the legal name, legal form, jurisdiction and position in the chain are correct, and list any discrepancy with the exact text to change. Specifically confirm:</w:t>
+        <w:t xml:space="preserve">The structure chart (Project Denali,</w:t>
+      </w:r>
+      <w:r>
+        <w:t xml:space="preserve"> </w:t>
+      </w:r>
+      <w:r>
+        <w:t xml:space="preserve">“</w:t>
+      </w:r>
+      <w:r>
+        <w:t xml:space="preserve">Transaction Structure</w:t>
+      </w:r>
+      <w:r>
+        <w:t xml:space="preserve">”</w:t>
+      </w:r>
+      <w:r>
+        <w:t xml:space="preserve">, dated 28 April 2026,</w:t>
+      </w:r>
+      <w:r>
+        <w:t xml:space="preserve"> </w:t>
+      </w:r>
+      <w:r>
+        <w:t xml:space="preserve">“</w:t>
+      </w:r>
+      <w:r>
+        <w:t xml:space="preserve">with Hermes</w:t>
+      </w:r>
+      <w:r>
+        <w:t xml:space="preserve">”</w:t>
+      </w:r>
+      <w:r>
+        <w:t xml:space="preserve"> </w:t>
+      </w:r>
+      <w:r>
+        <w:t xml:space="preserve">version) shows the following chain. Use it as the reference and tell me where the term sheet departs from it:</w:t>
       </w:r>
     </w:p>
     <w:p>
@@ -71,6 +104,62 @@
         <w:numPr>
           <w:ilvl w:val="0"/>
           <w:numId w:val="1001"/>
+        </w:numPr>
+        <w:pStyle w:val="Compact"/>
+      </w:pPr>
+      <w:r>
+        <w:t xml:space="preserve">Corsair European Insurance Services LP (Cayman) is the 79.0% LP of Denali EIS SCSp (Luxembourg); Federated Hermes GPE Horizon III Holdings LP and Hermes GPE PEC V Non-US LP are the 21.0% LP. Denali GP SARL is GP of Denali EIS.</w:t>
+      </w:r>
+    </w:p>
+    <w:p>
+      <w:pPr>
+        <w:numPr>
+          <w:ilvl w:val="0"/>
+          <w:numId w:val="1001"/>
+        </w:numPr>
+        <w:pStyle w:val="Compact"/>
+      </w:pPr>
+      <w:r>
+        <w:t xml:space="preserve">Denali Holdings I SARL (Luxembourg) is held: Denali EIS SCSp 47.3%, Denali Pooling I SCA (Luxembourg) 27.5%, Management Institutional Strip Shares 25.1%, Denali Management Holdings SCSp 0.1%.</w:t>
+      </w:r>
+    </w:p>
+    <w:p>
+      <w:pPr>
+        <w:numPr>
+          <w:ilvl w:val="0"/>
+          <w:numId w:val="1001"/>
+        </w:numPr>
+        <w:pStyle w:val="Compact"/>
+      </w:pPr>
+      <w:r>
+        <w:t xml:space="preserve">Denali Holdings I SARL → Denali Holdings II SARL → Denali Holdings III SARL → Qualefortill Investments Sp. z o.o. (Poland) → MJM Holdings Sp. z o.o., each at 100%.</w:t>
+      </w:r>
+    </w:p>
+    <w:p>
+      <w:pPr>
+        <w:numPr>
+          <w:ilvl w:val="0"/>
+          <w:numId w:val="1001"/>
+        </w:numPr>
+        <w:pStyle w:val="Compact"/>
+      </w:pPr>
+      <w:r>
+        <w:t xml:space="preserve">The chart does not show who holds Denali Pooling I SCA, and Effinity does not appear anywhere on it.</w:t>
+      </w:r>
+    </w:p>
+    <w:p>
+      <w:pPr>
+        <w:pStyle w:val="FirstParagraph"/>
+      </w:pPr>
+      <w:r>
+        <w:t xml:space="preserve">For every entity named in the term sheet, confirm the legal name, legal form, jurisdiction and position in the chain against the chart, and list any discrepancy with the exact text to change. Specifically:</w:t>
+      </w:r>
+    </w:p>
+    <w:p>
+      <w:pPr>
+        <w:numPr>
+          <w:ilvl w:val="0"/>
+          <w:numId w:val="1002"/>
         </w:numPr>
         <w:pStyle w:val="Compact"/>
       </w:pPr>
@@ -85,6 +174,12 @@
         <w:t xml:space="preserve"> </w:t>
       </w:r>
       <w:r>
+        <w:t xml:space="preserve">the term sheet names</w:t>
+      </w:r>
+      <w:r>
+        <w:t xml:space="preserve"> </w:t>
+      </w:r>
+      <w:r>
         <w:t xml:space="preserve">“</w:t>
       </w:r>
       <w:r>
@@ -97,7 +192,55 @@
         <w:t xml:space="preserve"> </w:t>
       </w:r>
       <w:r>
-        <w:t xml:space="preserve">Is this the correct Corsair vehicle that sits in the Denali chain on the chart? Is CEIS actually a shareholder in Denali Pooling (so that it acquires alongside Effinity at the same level), or does it hold at Denali I or elsewhere? Confirm the defined‑term approach</w:t>
+        <w:t xml:space="preserve">as buyer and describes CEIS as</w:t>
+      </w:r>
+      <w:r>
+        <w:t xml:space="preserve"> </w:t>
+      </w:r>
+      <w:r>
+        <w:t xml:space="preserve">“</w:t>
+      </w:r>
+      <w:r>
+        <w:t xml:space="preserve">an existing indirect shareholder of the Company</w:t>
+      </w:r>
+      <w:r>
+        <w:t xml:space="preserve">”</w:t>
+      </w:r>
+      <w:r>
+        <w:t xml:space="preserve">. Per the chart CEIS holds only through Denali EIS SCSp and is not a shareholder of Denali Pooling. Confirm (a) whether CEIS is intended to buy the Denali Pooling shares directly, creating a new direct holding alongside Denali Pooling’s other shareholders, or whether Denali EIS SCSp (in which Hermes has a 21% interest) should be the buyer; (b) that the Cayman LP name and form are correct (</w:t>
+      </w:r>
+      <w:r>
+        <w:t xml:space="preserve">“</w:t>
+      </w:r>
+      <w:r>
+        <w:t xml:space="preserve">LP</w:t>
+      </w:r>
+      <w:r>
+        <w:t xml:space="preserve">”</w:t>
+      </w:r>
+      <w:r>
+        <w:t xml:space="preserve"> </w:t>
+      </w:r>
+      <w:r>
+        <w:t xml:space="preserve">on the chart,</w:t>
+      </w:r>
+      <w:r>
+        <w:t xml:space="preserve"> </w:t>
+      </w:r>
+      <w:r>
+        <w:t xml:space="preserve">“</w:t>
+      </w:r>
+      <w:r>
+        <w:t xml:space="preserve">L.P.</w:t>
+      </w:r>
+      <w:r>
+        <w:t xml:space="preserve">”</w:t>
+      </w:r>
+      <w:r>
+        <w:t xml:space="preserve"> </w:t>
+      </w:r>
+      <w:r>
+        <w:t xml:space="preserve">in the term sheet); and (c) that</w:t>
       </w:r>
       <w:r>
         <w:t xml:space="preserve"> </w:t>
@@ -112,14 +255,14 @@
         <w:t xml:space="preserve">”</w:t>
       </w:r>
       <w:r>
-        <w:t xml:space="preserve">CEIS”)” is consistent with the vehicle on the chart.</w:t>
-      </w:r>
-    </w:p>
-    <w:p>
-      <w:pPr>
-        <w:numPr>
-          <w:ilvl w:val="0"/>
-          <w:numId w:val="1001"/>
+        <w:t xml:space="preserve">CEIS”)” is the right defined-term approach given CEIS is a Cayman fund vehicle rather than an operating company.</w:t>
+      </w:r>
+    </w:p>
+    <w:p>
+      <w:pPr>
+        <w:numPr>
+          <w:ilvl w:val="0"/>
+          <w:numId w:val="1002"/>
         </w:numPr>
         <w:pStyle w:val="Compact"/>
       </w:pPr>
@@ -143,7 +286,7 @@
         <w:t xml:space="preserve">”</w:t>
       </w:r>
       <w:r>
-        <w:t xml:space="preserve">. Check the spelling of the entity name (one f or two) and of the legal form (</w:t>
+        <w:t xml:space="preserve">. Effinity is not on the chart, so the review cannot verify it against the chart; instead check the spelling of the entity name (one f or two) and of the legal form (</w:t>
       </w:r>
       <w:r>
         <w:t xml:space="preserve">“</w:t>
@@ -191,14 +334,14 @@
         <w:t xml:space="preserve"> </w:t>
       </w:r>
       <w:r>
-        <w:t xml:space="preserve">and the signature block consistent with the correct legal name.</w:t>
-      </w:r>
-    </w:p>
-    <w:p>
-      <w:pPr>
-        <w:numPr>
-          <w:ilvl w:val="0"/>
-          <w:numId w:val="1001"/>
+        <w:t xml:space="preserve">and the signature block consistent with the correct legal name. Note that the chart should be updated to show the Denali Pooling shareholders if it is to be relied on.</w:t>
+      </w:r>
+    </w:p>
+    <w:p>
+      <w:pPr>
+        <w:numPr>
+          <w:ilvl w:val="0"/>
+          <w:numId w:val="1002"/>
         </w:numPr>
         <w:pStyle w:val="Compact"/>
       </w:pPr>
@@ -207,7 +350,7 @@
           <w:bCs/>
           <w:b/>
         </w:rPr>
-        <w:t xml:space="preserve">Target company of the Sale Shares:</w:t>
+        <w:t xml:space="preserve">Entity whose shares are sold:</w:t>
       </w:r>
       <w:r>
         <w:t xml:space="preserve"> </w:t>
@@ -237,14 +380,14 @@
         <w:t xml:space="preserve">”</w:t>
       </w:r>
       <w:r>
-        <w:t xml:space="preserve">). Confirm the full legal name and form (SCA, SCSp, etc.), jurisdiction, and that Effinity’s shares sit at this entity rather than at Denali I.</w:t>
-      </w:r>
-    </w:p>
-    <w:p>
-      <w:pPr>
-        <w:numPr>
-          <w:ilvl w:val="0"/>
-          <w:numId w:val="1001"/>
+        <w:t xml:space="preserve">). Confirm this matches the chart (it does on name and form) and that Effinity’s shares sit here rather than at Denali Holdings I.</w:t>
+      </w:r>
+    </w:p>
+    <w:p>
+      <w:pPr>
+        <w:numPr>
+          <w:ilvl w:val="0"/>
+          <w:numId w:val="1002"/>
         </w:numPr>
         <w:pStyle w:val="Compact"/>
       </w:pPr>
@@ -259,6 +402,12 @@
         <w:t xml:space="preserve"> </w:t>
       </w:r>
       <w:r>
+        <w:t xml:space="preserve">the term sheet uses</w:t>
+      </w:r>
+      <w:r>
+        <w:t xml:space="preserve"> </w:t>
+      </w:r>
+      <w:r>
         <w:t xml:space="preserve">“</w:t>
       </w:r>
       <w:r>
@@ -268,14 +417,80 @@
         <w:t xml:space="preserve">”</w:t>
       </w:r>
       <w:r>
-        <w:t xml:space="preserve">. Confirm the correct form and capitalisation (S.à r.l.) and its place in the chain between Denali Pooling and MJM.</w:t>
-      </w:r>
-    </w:p>
-    <w:p>
-      <w:pPr>
-        <w:numPr>
-          <w:ilvl w:val="0"/>
-          <w:numId w:val="1001"/>
+        <w:t xml:space="preserve"> </w:t>
+      </w:r>
+      <w:r>
+        <w:t xml:space="preserve">and the SHA is called the</w:t>
+      </w:r>
+      <w:r>
+        <w:t xml:space="preserve"> </w:t>
+      </w:r>
+      <w:r>
+        <w:t xml:space="preserve">“</w:t>
+      </w:r>
+      <w:r>
+        <w:t xml:space="preserve">Denali Holding I Shareholders Agreement</w:t>
+      </w:r>
+      <w:r>
+        <w:t xml:space="preserve">”</w:t>
+      </w:r>
+      <w:r>
+        <w:t xml:space="preserve">. The chart uses</w:t>
+      </w:r>
+      <w:r>
+        <w:t xml:space="preserve"> </w:t>
+      </w:r>
+      <w:r>
+        <w:t xml:space="preserve">“</w:t>
+      </w:r>
+      <w:r>
+        <w:t xml:space="preserve">Denali Holdings I SARL</w:t>
+      </w:r>
+      <w:r>
+        <w:t xml:space="preserve">”</w:t>
+      </w:r>
+      <w:r>
+        <w:t xml:space="preserve"> </w:t>
+      </w:r>
+      <w:r>
+        <w:t xml:space="preserve">(plural). Confirm the correct legal name from the Luxembourg register and align the entity name, the SHA title and the form (</w:t>
+      </w:r>
+      <w:r>
+        <w:t xml:space="preserve">“</w:t>
+      </w:r>
+      <w:r>
+        <w:t xml:space="preserve">S.à r.l.</w:t>
+      </w:r>
+      <w:r>
+        <w:t xml:space="preserve">”</w:t>
+      </w:r>
+      <w:r>
+        <w:t xml:space="preserve"> </w:t>
+      </w:r>
+      <w:r>
+        <w:t xml:space="preserve">/</w:t>
+      </w:r>
+      <w:r>
+        <w:t xml:space="preserve"> </w:t>
+      </w:r>
+      <w:r>
+        <w:t xml:space="preserve">“</w:t>
+      </w:r>
+      <w:r>
+        <w:t xml:space="preserve">SARL</w:t>
+      </w:r>
+      <w:r>
+        <w:t xml:space="preserve">”</w:t>
+      </w:r>
+      <w:r>
+        <w:t xml:space="preserve">) throughout.</w:t>
+      </w:r>
+    </w:p>
+    <w:p>
+      <w:pPr>
+        <w:numPr>
+          <w:ilvl w:val="0"/>
+          <w:numId w:val="1002"/>
         </w:numPr>
         <w:pStyle w:val="Compact"/>
       </w:pPr>
@@ -284,25 +499,83 @@
           <w:bCs/>
           <w:b/>
         </w:rPr>
-        <w:t xml:space="preserve">MJM Holdings:</w:t>
-      </w:r>
-      <w:r>
-        <w:t xml:space="preserve"> </w:t>
-      </w:r>
-      <w:r>
-        <w:t xml:space="preserve">confirm this is the correct name of the operating holding company and that Denali I is its indirect (not direct) holding company as stated.</w:t>
-      </w:r>
-    </w:p>
-    <w:p>
-      <w:pPr>
-        <w:numPr>
-          <w:ilvl w:val="0"/>
-          <w:numId w:val="1001"/>
-        </w:numPr>
-        <w:pStyle w:val="Compact"/>
-      </w:pPr>
-      <w:r>
-        <w:t xml:space="preserve">Any other entities on the chart that should be referenced but are not (for example an intermediate holding company between Denali I and MJM, or a Denali EIS‑type vehicle through which CEIS holds), and whether their absence creates any inaccuracy in the term sheet.</w:t>
+        <w:t xml:space="preserve">MJM:</w:t>
+      </w:r>
+      <w:r>
+        <w:t xml:space="preserve"> </w:t>
+      </w:r>
+      <w:r>
+        <w:t xml:space="preserve">“</w:t>
+      </w:r>
+      <w:r>
+        <w:t xml:space="preserve">MJM Holdings</w:t>
+      </w:r>
+      <w:r>
+        <w:t xml:space="preserve">”</w:t>
+      </w:r>
+      <w:r>
+        <w:t xml:space="preserve"> </w:t>
+      </w:r>
+      <w:r>
+        <w:t xml:space="preserve">in the term sheet versus</w:t>
+      </w:r>
+      <w:r>
+        <w:t xml:space="preserve"> </w:t>
+      </w:r>
+      <w:r>
+        <w:t xml:space="preserve">“</w:t>
+      </w:r>
+      <w:r>
+        <w:t xml:space="preserve">MJM Holdings Sp. z o.o.</w:t>
+      </w:r>
+      <w:r>
+        <w:t xml:space="preserve">”</w:t>
+      </w:r>
+      <w:r>
+        <w:t xml:space="preserve"> </w:t>
+      </w:r>
+      <w:r>
+        <w:t xml:space="preserve">on the chart. Confirm whether the full form should be used on first reference. Confirm</w:t>
+      </w:r>
+      <w:r>
+        <w:t xml:space="preserve"> </w:t>
+      </w:r>
+      <w:r>
+        <w:t xml:space="preserve">“</w:t>
+      </w:r>
+      <w:r>
+        <w:t xml:space="preserve">indirect holding company</w:t>
+      </w:r>
+      <w:r>
+        <w:t xml:space="preserve">”</w:t>
+      </w:r>
+      <w:r>
+        <w:t xml:space="preserve"> </w:t>
+      </w:r>
+      <w:r>
+        <w:t xml:space="preserve">is accurate: per the chart Denali I sits four levels above MJM Holdings (via Denali Holdings II, Denali Holdings III and Qualefortill Investments), so the description is correct but check whether Qualefortill or the intermediate holdcos need to be mentioned anywhere (for example in the net debt deduction, since the debt and hedge sit at Denali Holdings III and Qualefortill).</w:t>
+      </w:r>
+    </w:p>
+    <w:p>
+      <w:pPr>
+        <w:numPr>
+          <w:ilvl w:val="0"/>
+          <w:numId w:val="1002"/>
+        </w:numPr>
+        <w:pStyle w:val="Compact"/>
+      </w:pPr>
+      <w:r>
+        <w:rPr>
+          <w:bCs/>
+          <w:b/>
+        </w:rPr>
+        <w:t xml:space="preserve">Hermes:</w:t>
+      </w:r>
+      <w:r>
+        <w:t xml:space="preserve"> </w:t>
+      </w:r>
+      <w:r>
+        <w:t xml:space="preserve">Hermes is not named in the term sheet. Confirm that is deliberate, and flag whether Hermes’ 21% interest in Denali EIS gives it any consent, pre-emption or tag right over a transfer of Denali Pooling shares under the SHA or the Denali EIS documents that the Conditions to Completion should mention.</w:t>
       </w:r>
     </w:p>
     <w:p>
@@ -335,7 +608,7 @@
       <w:pPr>
         <w:numPr>
           <w:ilvl w:val="0"/>
-          <w:numId w:val="1002"/>
+          <w:numId w:val="1003"/>
         </w:numPr>
         <w:pStyle w:val="Compact"/>
       </w:pPr>
@@ -362,7 +635,7 @@
       <w:pPr>
         <w:numPr>
           <w:ilvl w:val="0"/>
-          <w:numId w:val="1002"/>
+          <w:numId w:val="1003"/>
         </w:numPr>
         <w:pStyle w:val="Compact"/>
       </w:pPr>
@@ -374,7 +647,7 @@
       <w:pPr>
         <w:numPr>
           <w:ilvl w:val="0"/>
-          <w:numId w:val="1002"/>
+          <w:numId w:val="1003"/>
         </w:numPr>
         <w:pStyle w:val="Compact"/>
       </w:pPr>
@@ -404,7 +677,7 @@
       <w:pPr>
         <w:numPr>
           <w:ilvl w:val="0"/>
-          <w:numId w:val="1002"/>
+          <w:numId w:val="1003"/>
         </w:numPr>
         <w:pStyle w:val="Compact"/>
       </w:pPr>
@@ -431,7 +704,7 @@
       <w:pPr>
         <w:numPr>
           <w:ilvl w:val="0"/>
-          <w:numId w:val="1002"/>
+          <w:numId w:val="1003"/>
         </w:numPr>
         <w:pStyle w:val="Compact"/>
       </w:pPr>
@@ -443,7 +716,7 @@
       <w:pPr>
         <w:numPr>
           <w:ilvl w:val="0"/>
-          <w:numId w:val="1002"/>
+          <w:numId w:val="1003"/>
         </w:numPr>
         <w:pStyle w:val="Compact"/>
       </w:pPr>
@@ -465,7 +738,7 @@
       <w:pPr>
         <w:numPr>
           <w:ilvl w:val="0"/>
-          <w:numId w:val="1003"/>
+          <w:numId w:val="1004"/>
         </w:numPr>
         <w:pStyle w:val="Compact"/>
       </w:pPr>
@@ -552,7 +825,7 @@
       <w:pPr>
         <w:numPr>
           <w:ilvl w:val="0"/>
-          <w:numId w:val="1003"/>
+          <w:numId w:val="1004"/>
         </w:numPr>
         <w:pStyle w:val="Compact"/>
       </w:pPr>
@@ -576,7 +849,7 @@
       <w:pPr>
         <w:numPr>
           <w:ilvl w:val="0"/>
-          <w:numId w:val="1003"/>
+          <w:numId w:val="1004"/>
         </w:numPr>
         <w:pStyle w:val="Compact"/>
       </w:pPr>
@@ -630,19 +903,19 @@
       <w:pPr>
         <w:numPr>
           <w:ilvl w:val="0"/>
-          <w:numId w:val="1003"/>
-        </w:numPr>
-        <w:pStyle w:val="Compact"/>
-      </w:pPr>
-      <w:r>
-        <w:t xml:space="preserve">Share counts: confirm the nine line items sum correctly to Effinity’s holding and that the 23.9% / 25.2% (Denali Pooling) and 6.6% / 6.3% (Denali I look‑through) percentages are consistent with each other and with the cap table in the structure chart, if the chart shows percentages.</w:t>
-      </w:r>
-    </w:p>
-    <w:p>
-      <w:pPr>
-        <w:numPr>
-          <w:ilvl w:val="0"/>
-          <w:numId w:val="1003"/>
+          <w:numId w:val="1004"/>
+        </w:numPr>
+        <w:pStyle w:val="Compact"/>
+      </w:pPr>
+      <w:r>
+        <w:t xml:space="preserve">Share counts and percentages: confirm the nine line items sum correctly to Effinity’s holding. Then test the look‑through arithmetic against the chart: Denali Pooling holds 27.5% of Denali Holdings I, so 23.9% of Denali Pooling’s Preference Shares implies roughly 6.6% of Denali I on a look‑through basis, which agrees with the term sheet, but 25.2% of Denali Pooling’s Ordinary Shares implies roughly 6.9%, not the 6.3% stated. Explain the difference (for example Denali Pooling holding a different proportion of Ordinary and Preference Shares in Denali I than the single 27.5% on the chart) or correct the figure.</w:t>
+      </w:r>
+    </w:p>
+    <w:p>
+      <w:pPr>
+        <w:numPr>
+          <w:ilvl w:val="0"/>
+          <w:numId w:val="1004"/>
         </w:numPr>
         <w:pStyle w:val="Compact"/>
       </w:pPr>
@@ -723,7 +996,7 @@
       <w:pPr>
         <w:numPr>
           <w:ilvl w:val="0"/>
-          <w:numId w:val="1003"/>
+          <w:numId w:val="1004"/>
         </w:numPr>
         <w:pStyle w:val="Compact"/>
       </w:pPr>
@@ -735,7 +1008,7 @@
       <w:pPr>
         <w:numPr>
           <w:ilvl w:val="0"/>
-          <w:numId w:val="1003"/>
+          <w:numId w:val="1004"/>
         </w:numPr>
         <w:pStyle w:val="Compact"/>
       </w:pPr>
@@ -757,7 +1030,7 @@
       <w:pPr>
         <w:numPr>
           <w:ilvl w:val="0"/>
-          <w:numId w:val="1004"/>
+          <w:numId w:val="1005"/>
         </w:numPr>
         <w:pStyle w:val="Compact"/>
       </w:pPr>
@@ -784,7 +1057,7 @@
       <w:pPr>
         <w:numPr>
           <w:ilvl w:val="0"/>
-          <w:numId w:val="1004"/>
+          <w:numId w:val="1005"/>
         </w:numPr>
         <w:pStyle w:val="Compact"/>
       </w:pPr>
@@ -796,7 +1069,7 @@
       <w:pPr>
         <w:numPr>
           <w:ilvl w:val="0"/>
-          <w:numId w:val="1004"/>
+          <w:numId w:val="1005"/>
         </w:numPr>
         <w:pStyle w:val="Compact"/>
       </w:pPr>
@@ -859,7 +1132,7 @@
       <w:pPr>
         <w:numPr>
           <w:ilvl w:val="0"/>
-          <w:numId w:val="1004"/>
+          <w:numId w:val="1005"/>
         </w:numPr>
         <w:pStyle w:val="Compact"/>
       </w:pPr>
@@ -889,7 +1162,7 @@
       <w:pPr>
         <w:numPr>
           <w:ilvl w:val="0"/>
-          <w:numId w:val="1004"/>
+          <w:numId w:val="1005"/>
         </w:numPr>
         <w:pStyle w:val="Compact"/>
       </w:pPr>
@@ -919,7 +1192,7 @@
       <w:pPr>
         <w:numPr>
           <w:ilvl w:val="0"/>
-          <w:numId w:val="1004"/>
+          <w:numId w:val="1005"/>
         </w:numPr>
         <w:pStyle w:val="Compact"/>
       </w:pPr>
@@ -1048,7 +1321,7 @@
       <w:pPr>
         <w:numPr>
           <w:ilvl w:val="0"/>
-          <w:numId w:val="1005"/>
+          <w:numId w:val="1006"/>
         </w:numPr>
         <w:pStyle w:val="Compact"/>
       </w:pPr>
@@ -1060,7 +1333,7 @@
       <w:pPr>
         <w:numPr>
           <w:ilvl w:val="0"/>
-          <w:numId w:val="1005"/>
+          <w:numId w:val="1006"/>
         </w:numPr>
         <w:pStyle w:val="Compact"/>
       </w:pPr>
@@ -1072,7 +1345,7 @@
       <w:pPr>
         <w:numPr>
           <w:ilvl w:val="0"/>
-          <w:numId w:val="1005"/>
+          <w:numId w:val="1006"/>
         </w:numPr>
         <w:pStyle w:val="Compact"/>
       </w:pPr>
@@ -1373,6 +1646,9 @@
     <w:abstractNumId w:val="991"/>
   </w:num>
   <w:num w:numId="1005">
+    <w:abstractNumId w:val="991"/>
+  </w:num>
+  <w:num w:numId="1006">
     <w:abstractNumId w:val="99411"/>
     <w:lvlOverride w:ilvl="0">
       <w:startOverride w:val="1"/>

</xml_diff>